<commit_message>
fix all problem, sstart table merge split
</commit_message>
<xml_diff>
--- a/tst - Copy.docx
+++ b/tst - Copy.docx
@@ -178,6 +178,14 @@
                 <w:color w:val="000000"/>
                 <w:sz w:val="24"/>
               </w:rPr>
+              <w:t>1</w:t>
+            </w:r>
+            <w:r>
+              <w:rPr>
+                <w:rFonts w:ascii="Times New Roman" w:hAnsi="Times New Roman"/>
+                <w:color w:val="000000"/>
+                <w:sz w:val="24"/>
+              </w:rPr>
               <w:t xml:space="preserve">афыафыафыфаф3 </w:t>
             </w:r>
             <w:proofErr w:type="spellStart"/>
@@ -262,6 +270,14 @@
               <w:spacing w:after="0" w:line="240" w:lineRule="auto"/>
               <w:jc w:val="center"/>
             </w:pPr>
+            <w:r>
+              <w:rPr>
+                <w:rFonts w:ascii="Times New Roman" w:hAnsi="Times New Roman"/>
+                <w:color w:val="000000"/>
+                <w:sz w:val="24"/>
+              </w:rPr>
+              <w:t>11</w:t>
+            </w:r>
             <w:r>
               <w:rPr>
                 <w:rFonts w:ascii="Times New Roman" w:hAnsi="Times New Roman"/>
@@ -366,7 +382,8 @@
         </w:tc>
         <w:tc>
           <w:tcPr>
-            <w:tcW w:w="2338" w:type="dxa"/>
+            <w:tcW w:w="7012" w:type="dxa"/>
+            <w:gridSpan w:val="3"/>
             <w:tcBorders>
               <w:top w:val="single" w:sz="4" w:space="0" w:color="000000"/>
               <w:left w:val="single" w:sz="4" w:space="0" w:color="000000"/>
@@ -379,32 +396,27 @@
             <w:pPr>
               <w:spacing w:after="0" w:line="240" w:lineRule="auto"/>
               <w:jc w:val="center"/>
+              <w:rPr>
+                <w:lang w:val="ru-RU"/>
+              </w:rPr>
             </w:pPr>
             <w:r>
               <w:rPr>
                 <w:rFonts w:ascii="Times New Roman" w:hAnsi="Times New Roman"/>
                 <w:color w:val="000000"/>
                 <w:sz w:val="24"/>
+                <w:lang w:val="ru-RU"/>
               </w:rPr>
               <w:t>2</w:t>
             </w:r>
           </w:p>
-        </w:tc>
-        <w:tc>
-          <w:tcPr>
-            <w:tcW w:w="2337" w:type="dxa"/>
-            <w:tcBorders>
-              <w:top w:val="single" w:sz="4" w:space="0" w:color="000000"/>
-              <w:left w:val="single" w:sz="4" w:space="0" w:color="000000"/>
-              <w:bottom w:val="single" w:sz="4" w:space="0" w:color="000000"/>
-              <w:right w:val="single" w:sz="4" w:space="0" w:color="000000"/>
-            </w:tcBorders>
-            <w:vAlign w:val="center"/>
-          </w:tcPr>
           <w:p>
             <w:pPr>
               <w:spacing w:after="0" w:line="240" w:lineRule="auto"/>
               <w:jc w:val="center"/>
+              <w:rPr>
+                <w:lang w:val="ru-RU"/>
+              </w:rPr>
             </w:pPr>
             <w:proofErr w:type="spellStart"/>
             <w:r>
@@ -412,6 +424,7 @@
                 <w:rFonts w:ascii="Times New Roman" w:hAnsi="Times New Roman"/>
                 <w:color w:val="000000"/>
                 <w:sz w:val="24"/>
+                <w:lang w:val="ru-RU"/>
               </w:rPr>
               <w:t>вфыв</w:t>
             </w:r>
@@ -421,6 +434,7 @@
                 <w:rFonts w:ascii="Times New Roman" w:hAnsi="Times New Roman"/>
                 <w:color w:val="000000"/>
                 <w:sz w:val="24"/>
+                <w:lang w:val="ru-RU"/>
               </w:rPr>
               <w:t xml:space="preserve"> </w:t>
             </w:r>
@@ -430,6 +444,7 @@
                 <w:rFonts w:ascii="Times New Roman" w:hAnsi="Times New Roman"/>
                 <w:color w:val="000000"/>
                 <w:sz w:val="24"/>
+                <w:lang w:val="ru-RU"/>
               </w:rPr>
               <w:t>фыв</w:t>
             </w:r>
@@ -439,22 +454,11 @@
                 <w:rFonts w:ascii="Times New Roman" w:hAnsi="Times New Roman"/>
                 <w:color w:val="000000"/>
                 <w:sz w:val="24"/>
+                <w:lang w:val="ru-RU"/>
               </w:rPr>
               <w:t xml:space="preserve"> фыв1в2 3</w:t>
             </w:r>
           </w:p>
-        </w:tc>
-        <w:tc>
-          <w:tcPr>
-            <w:tcW w:w="2337" w:type="dxa"/>
-            <w:tcBorders>
-              <w:top w:val="single" w:sz="4" w:space="0" w:color="000000"/>
-              <w:left w:val="single" w:sz="4" w:space="0" w:color="000000"/>
-              <w:bottom w:val="single" w:sz="4" w:space="0" w:color="000000"/>
-              <w:right w:val="single" w:sz="4" w:space="0" w:color="000000"/>
-            </w:tcBorders>
-            <w:vAlign w:val="center"/>
-          </w:tcPr>
           <w:p>
             <w:pPr>
               <w:spacing w:after="0" w:line="240" w:lineRule="auto"/>
@@ -470,7 +474,78 @@
                 <w:sz w:val="24"/>
                 <w:lang w:val="ru-RU"/>
               </w:rPr>
-              <w:t xml:space="preserve">3вфыв  ыфв фыв фыв 1у2ву1 </w:t>
+              <w:t>3</w:t>
+            </w:r>
+            <w:proofErr w:type="gramStart"/>
+            <w:r>
+              <w:rPr>
+                <w:rFonts w:ascii="Times New Roman" w:hAnsi="Times New Roman"/>
+                <w:color w:val="000000"/>
+                <w:sz w:val="24"/>
+                <w:lang w:val="ru-RU"/>
+              </w:rPr>
+              <w:t xml:space="preserve">вфыв  </w:t>
+            </w:r>
+            <w:proofErr w:type="spellStart"/>
+            <w:r>
+              <w:rPr>
+                <w:rFonts w:ascii="Times New Roman" w:hAnsi="Times New Roman"/>
+                <w:color w:val="000000"/>
+                <w:sz w:val="24"/>
+                <w:lang w:val="ru-RU"/>
+              </w:rPr>
+              <w:t>ыфв</w:t>
+            </w:r>
+            <w:proofErr w:type="spellEnd"/>
+            <w:proofErr w:type="gramEnd"/>
+            <w:r>
+              <w:rPr>
+                <w:rFonts w:ascii="Times New Roman" w:hAnsi="Times New Roman"/>
+                <w:color w:val="000000"/>
+                <w:sz w:val="24"/>
+                <w:lang w:val="ru-RU"/>
+              </w:rPr>
+              <w:t xml:space="preserve"> </w:t>
+            </w:r>
+            <w:proofErr w:type="spellStart"/>
+            <w:r>
+              <w:rPr>
+                <w:rFonts w:ascii="Times New Roman" w:hAnsi="Times New Roman"/>
+                <w:color w:val="000000"/>
+                <w:sz w:val="24"/>
+                <w:lang w:val="ru-RU"/>
+              </w:rPr>
+              <w:t>фыв</w:t>
+            </w:r>
+            <w:proofErr w:type="spellEnd"/>
+            <w:r>
+              <w:rPr>
+                <w:rFonts w:ascii="Times New Roman" w:hAnsi="Times New Roman"/>
+                <w:color w:val="000000"/>
+                <w:sz w:val="24"/>
+                <w:lang w:val="ru-RU"/>
+              </w:rPr>
+              <w:t xml:space="preserve"> </w:t>
+            </w:r>
+            <w:proofErr w:type="spellStart"/>
+            <w:r>
+              <w:rPr>
+                <w:rFonts w:ascii="Times New Roman" w:hAnsi="Times New Roman"/>
+                <w:color w:val="000000"/>
+                <w:sz w:val="24"/>
+                <w:lang w:val="ru-RU"/>
+              </w:rPr>
+              <w:t>фыв</w:t>
+            </w:r>
+            <w:proofErr w:type="spellEnd"/>
+            <w:r>
+              <w:rPr>
+                <w:rFonts w:ascii="Times New Roman" w:hAnsi="Times New Roman"/>
+                <w:color w:val="000000"/>
+                <w:sz w:val="24"/>
+                <w:lang w:val="ru-RU"/>
+              </w:rPr>
+              <w:t xml:space="preserve"> 1у2ву1 </w:t>
             </w:r>
           </w:p>
         </w:tc>
@@ -492,6 +567,9 @@
               <w:spacing w:after="0" w:line="240" w:lineRule="auto"/>
               <w:jc w:val="center"/>
               <w:rPr>
+                <w:rFonts w:ascii="Times New Roman" w:hAnsi="Times New Roman"/>
+                <w:color w:val="000000"/>
+                <w:sz w:val="24"/>
                 <w:lang w:val="ru-RU"/>
               </w:rPr>
             </w:pPr>
@@ -502,7 +580,85 @@
                 <w:sz w:val="24"/>
                 <w:lang w:val="ru-RU"/>
               </w:rPr>
-              <w:t>афыафыафыфаф3 афы афыа фыа фы</w:t>
+              <w:t>3</w:t>
+            </w:r>
+          </w:p>
+          <w:p>
+            <w:pPr>
+              <w:spacing w:after="0" w:line="240" w:lineRule="auto"/>
+              <w:jc w:val="center"/>
+              <w:rPr>
+                <w:lang w:val="ru-RU"/>
+              </w:rPr>
+            </w:pPr>
+            <w:r>
+              <w:rPr>
+                <w:rFonts w:ascii="Times New Roman" w:hAnsi="Times New Roman"/>
+                <w:color w:val="000000"/>
+                <w:sz w:val="24"/>
+                <w:lang w:val="ru-RU"/>
+              </w:rPr>
+              <w:t xml:space="preserve">афыафыафыфаф3 </w:t>
+            </w:r>
+            <w:proofErr w:type="spellStart"/>
+            <w:r>
+              <w:rPr>
+                <w:rFonts w:ascii="Times New Roman" w:hAnsi="Times New Roman"/>
+                <w:color w:val="000000"/>
+                <w:sz w:val="24"/>
+                <w:lang w:val="ru-RU"/>
+              </w:rPr>
+              <w:t>афы</w:t>
+            </w:r>
+            <w:proofErr w:type="spellEnd"/>
+            <w:r>
+              <w:rPr>
+                <w:rFonts w:ascii="Times New Roman" w:hAnsi="Times New Roman"/>
+                <w:color w:val="000000"/>
+                <w:sz w:val="24"/>
+                <w:lang w:val="ru-RU"/>
+              </w:rPr>
+              <w:t xml:space="preserve"> </w:t>
+            </w:r>
+            <w:proofErr w:type="spellStart"/>
+            <w:r>
+              <w:rPr>
+                <w:rFonts w:ascii="Times New Roman" w:hAnsi="Times New Roman"/>
+                <w:color w:val="000000"/>
+                <w:sz w:val="24"/>
+                <w:lang w:val="ru-RU"/>
+              </w:rPr>
+              <w:t>афыа</w:t>
+            </w:r>
+            <w:proofErr w:type="spellEnd"/>
+            <w:r>
+              <w:rPr>
+                <w:rFonts w:ascii="Times New Roman" w:hAnsi="Times New Roman"/>
+                <w:color w:val="000000"/>
+                <w:sz w:val="24"/>
+                <w:lang w:val="ru-RU"/>
+              </w:rPr>
+              <w:t xml:space="preserve"> </w:t>
+            </w:r>
+            <w:proofErr w:type="spellStart"/>
+            <w:r>
+              <w:rPr>
+                <w:rFonts w:ascii="Times New Roman" w:hAnsi="Times New Roman"/>
+                <w:color w:val="000000"/>
+                <w:sz w:val="24"/>
+                <w:lang w:val="ru-RU"/>
+              </w:rPr>
+              <w:t>фыа</w:t>
+            </w:r>
+            <w:proofErr w:type="spellEnd"/>
+            <w:r>
+              <w:rPr>
+                <w:rFonts w:ascii="Times New Roman" w:hAnsi="Times New Roman"/>
+                <w:color w:val="000000"/>
+                <w:sz w:val="24"/>
+                <w:lang w:val="ru-RU"/>
+              </w:rPr>
+              <w:t xml:space="preserve"> фы</w:t>
             </w:r>
           </w:p>
         </w:tc>
@@ -522,6 +678,9 @@
               <w:spacing w:after="0" w:line="240" w:lineRule="auto"/>
               <w:jc w:val="center"/>
               <w:rPr>
+                <w:rFonts w:ascii="Times New Roman" w:hAnsi="Times New Roman"/>
+                <w:color w:val="000000"/>
+                <w:sz w:val="24"/>
                 <w:lang w:val="ru-RU"/>
               </w:rPr>
             </w:pPr>
@@ -532,7 +691,65 @@
                 <w:sz w:val="24"/>
                 <w:lang w:val="ru-RU"/>
               </w:rPr>
-              <w:t>321увыф афыа321321фыафыфаф3 афы афыа фыа фы</w:t>
+              <w:t>3</w:t>
+            </w:r>
+          </w:p>
+          <w:p>
+            <w:pPr>
+              <w:spacing w:after="0" w:line="240" w:lineRule="auto"/>
+              <w:jc w:val="center"/>
+              <w:rPr>
+                <w:lang w:val="ru-RU"/>
+              </w:rPr>
+            </w:pPr>
+            <w:r>
+              <w:rPr>
+                <w:rFonts w:ascii="Times New Roman" w:hAnsi="Times New Roman"/>
+                <w:color w:val="000000"/>
+                <w:sz w:val="24"/>
+                <w:lang w:val="ru-RU"/>
+              </w:rPr>
+              <w:t xml:space="preserve">321увыф афыа321321фыафыфаф3 </w:t>
+            </w:r>
+            <w:proofErr w:type="spellStart"/>
+            <w:r>
+              <w:rPr>
+                <w:rFonts w:ascii="Times New Roman" w:hAnsi="Times New Roman"/>
+                <w:color w:val="000000"/>
+                <w:sz w:val="24"/>
+                <w:lang w:val="ru-RU"/>
+              </w:rPr>
+              <w:t>афы</w:t>
+            </w:r>
+            <w:proofErr w:type="spellEnd"/>
+            <w:r>
+              <w:rPr>
+                <w:rFonts w:ascii="Times New Roman" w:hAnsi="Times New Roman"/>
+                <w:color w:val="000000"/>
+                <w:sz w:val="24"/>
+                <w:lang w:val="ru-RU"/>
+              </w:rPr>
+              <w:t xml:space="preserve"> </w:t>
+            </w:r>
+            <w:proofErr w:type="spellStart"/>
+            <w:r>
+              <w:rPr>
+                <w:rFonts w:ascii="Times New Roman" w:hAnsi="Times New Roman"/>
+                <w:color w:val="000000"/>
+                <w:sz w:val="24"/>
+                <w:lang w:val="ru-RU"/>
+              </w:rPr>
+              <w:t>афыа</w:t>
+            </w:r>
+            <w:proofErr w:type="spellEnd"/>
+            <w:r>
+              <w:rPr>
+                <w:rFonts w:ascii="Times New Roman" w:hAnsi="Times New Roman"/>
+                <w:color w:val="000000"/>
+                <w:sz w:val="24"/>
+                <w:lang w:val="ru-RU"/>
+              </w:rPr>
+              <w:t xml:space="preserve"> фыа фы</w:t>
             </w:r>
           </w:p>
         </w:tc>
@@ -552,6 +769,9 @@
               <w:spacing w:after="0" w:line="240" w:lineRule="auto"/>
               <w:jc w:val="center"/>
               <w:rPr>
+                <w:rFonts w:ascii="Times New Roman" w:hAnsi="Times New Roman"/>
+                <w:color w:val="000000"/>
+                <w:sz w:val="24"/>
                 <w:lang w:val="ru-RU"/>
               </w:rPr>
             </w:pPr>
@@ -562,7 +782,65 @@
                 <w:sz w:val="24"/>
                 <w:lang w:val="ru-RU"/>
               </w:rPr>
-              <w:t>321увыф афыафыафыфаф3 афы афыа фыа фы</w:t>
+              <w:t>3</w:t>
+            </w:r>
+          </w:p>
+          <w:p>
+            <w:pPr>
+              <w:spacing w:after="0" w:line="240" w:lineRule="auto"/>
+              <w:jc w:val="center"/>
+              <w:rPr>
+                <w:lang w:val="ru-RU"/>
+              </w:rPr>
+            </w:pPr>
+            <w:r>
+              <w:rPr>
+                <w:rFonts w:ascii="Times New Roman" w:hAnsi="Times New Roman"/>
+                <w:color w:val="000000"/>
+                <w:sz w:val="24"/>
+                <w:lang w:val="ru-RU"/>
+              </w:rPr>
+              <w:t xml:space="preserve">321увыф афыафыафыфаф3 </w:t>
+            </w:r>
+            <w:proofErr w:type="spellStart"/>
+            <w:r>
+              <w:rPr>
+                <w:rFonts w:ascii="Times New Roman" w:hAnsi="Times New Roman"/>
+                <w:color w:val="000000"/>
+                <w:sz w:val="24"/>
+                <w:lang w:val="ru-RU"/>
+              </w:rPr>
+              <w:t>афы</w:t>
+            </w:r>
+            <w:proofErr w:type="spellEnd"/>
+            <w:r>
+              <w:rPr>
+                <w:rFonts w:ascii="Times New Roman" w:hAnsi="Times New Roman"/>
+                <w:color w:val="000000"/>
+                <w:sz w:val="24"/>
+                <w:lang w:val="ru-RU"/>
+              </w:rPr>
+              <w:t xml:space="preserve"> </w:t>
+            </w:r>
+            <w:proofErr w:type="spellStart"/>
+            <w:r>
+              <w:rPr>
+                <w:rFonts w:ascii="Times New Roman" w:hAnsi="Times New Roman"/>
+                <w:color w:val="000000"/>
+                <w:sz w:val="24"/>
+                <w:lang w:val="ru-RU"/>
+              </w:rPr>
+              <w:t>афыа</w:t>
+            </w:r>
+            <w:proofErr w:type="spellEnd"/>
+            <w:r>
+              <w:rPr>
+                <w:rFonts w:ascii="Times New Roman" w:hAnsi="Times New Roman"/>
+                <w:color w:val="000000"/>
+                <w:sz w:val="24"/>
+                <w:lang w:val="ru-RU"/>
+              </w:rPr>
+              <w:t xml:space="preserve"> фыа фы</w:t>
             </w:r>
           </w:p>
         </w:tc>
@@ -582,6 +860,9 @@
               <w:spacing w:after="0" w:line="240" w:lineRule="auto"/>
               <w:jc w:val="center"/>
               <w:rPr>
+                <w:rFonts w:ascii="Times New Roman" w:hAnsi="Times New Roman"/>
+                <w:color w:val="000000"/>
+                <w:sz w:val="24"/>
                 <w:lang w:val="ru-RU"/>
               </w:rPr>
             </w:pPr>
@@ -592,7 +873,65 @@
                 <w:sz w:val="24"/>
                 <w:lang w:val="ru-RU"/>
               </w:rPr>
-              <w:t>321увыф афыафыафыфаф3 афы афыа фыа фы</w:t>
+              <w:t>3</w:t>
+            </w:r>
+          </w:p>
+          <w:p>
+            <w:pPr>
+              <w:spacing w:after="0" w:line="240" w:lineRule="auto"/>
+              <w:jc w:val="center"/>
+              <w:rPr>
+                <w:lang w:val="ru-RU"/>
+              </w:rPr>
+            </w:pPr>
+            <w:r>
+              <w:rPr>
+                <w:rFonts w:ascii="Times New Roman" w:hAnsi="Times New Roman"/>
+                <w:color w:val="000000"/>
+                <w:sz w:val="24"/>
+                <w:lang w:val="ru-RU"/>
+              </w:rPr>
+              <w:t xml:space="preserve">321увыф афыафыафыфаф3 </w:t>
+            </w:r>
+            <w:proofErr w:type="spellStart"/>
+            <w:r>
+              <w:rPr>
+                <w:rFonts w:ascii="Times New Roman" w:hAnsi="Times New Roman"/>
+                <w:color w:val="000000"/>
+                <w:sz w:val="24"/>
+                <w:lang w:val="ru-RU"/>
+              </w:rPr>
+              <w:t>афы</w:t>
+            </w:r>
+            <w:proofErr w:type="spellEnd"/>
+            <w:r>
+              <w:rPr>
+                <w:rFonts w:ascii="Times New Roman" w:hAnsi="Times New Roman"/>
+                <w:color w:val="000000"/>
+                <w:sz w:val="24"/>
+                <w:lang w:val="ru-RU"/>
+              </w:rPr>
+              <w:t xml:space="preserve"> </w:t>
+            </w:r>
+            <w:proofErr w:type="spellStart"/>
+            <w:r>
+              <w:rPr>
+                <w:rFonts w:ascii="Times New Roman" w:hAnsi="Times New Roman"/>
+                <w:color w:val="000000"/>
+                <w:sz w:val="24"/>
+                <w:lang w:val="ru-RU"/>
+              </w:rPr>
+              <w:t>афыа</w:t>
+            </w:r>
+            <w:proofErr w:type="spellEnd"/>
+            <w:r>
+              <w:rPr>
+                <w:rFonts w:ascii="Times New Roman" w:hAnsi="Times New Roman"/>
+                <w:color w:val="000000"/>
+                <w:sz w:val="24"/>
+                <w:lang w:val="ru-RU"/>
+              </w:rPr>
+              <w:t xml:space="preserve"> фыа фы</w:t>
             </w:r>
           </w:p>
         </w:tc>
@@ -775,6 +1114,7 @@
           <w:color w:val="000000"/>
           <w:sz w:val="28"/>
         </w:rPr>
+        <w:lastRenderedPageBreak/>
         <w:t>dasda</w:t>
       </w:r>
       <w:r>
@@ -832,7 +1172,6 @@
           <w:sz w:val="28"/>
           <w:lang w:val="ru-RU"/>
         </w:rPr>
-        <w:lastRenderedPageBreak/>
         <w:t>1.1 Новый222 заголовок</w:t>
       </w:r>
     </w:p>
@@ -929,7 +1268,27 @@
           <w:sz w:val="28"/>
           <w:lang w:val="ru-RU"/>
         </w:rPr>
-        <w:t xml:space="preserve"> эомент]</w:t>
+        <w:t xml:space="preserve"> </w:t>
+      </w:r>
+      <w:proofErr w:type="spellStart"/>
+      <w:r>
+        <w:rPr>
+          <w:rFonts w:ascii="Times New Roman" w:hAnsi="Times New Roman"/>
+          <w:color w:val="000000"/>
+          <w:sz w:val="28"/>
+          <w:lang w:val="ru-RU"/>
+        </w:rPr>
+        <w:t>эомент</w:t>
+      </w:r>
+      <w:proofErr w:type="spellEnd"/>
+      <w:r>
+        <w:rPr>
+          <w:rFonts w:ascii="Times New Roman" w:hAnsi="Times New Roman"/>
+          <w:color w:val="000000"/>
+          <w:sz w:val="28"/>
+          <w:lang w:val="ru-RU"/>
+        </w:rPr>
+        <w:t>]</w:t>
       </w:r>
     </w:p>
     <w:p>
@@ -2091,6 +2450,7 @@
           <w:color w:val="000000"/>
           <w:sz w:val="28"/>
         </w:rPr>
+        <w:lastRenderedPageBreak/>
         <w:t>dksamdkasmdkasmdk</w:t>
       </w:r>
       <w:proofErr w:type="spellEnd"/>
@@ -2230,7 +2590,6 @@
         <w:rPr>
           <w:noProof/>
         </w:rPr>
-        <w:lastRenderedPageBreak/>
         <w:drawing>
           <wp:inline distT="0" distB="0" distL="0" distR="0" wp14:anchorId="65683D8F" wp14:editId="6B0E8CE2">
             <wp:extent cx="1270000" cy="1270000"/>

</xml_diff>